<commit_message>
Poster Hăm da ngang: sửa theo nhận xét bán tại quầy + thêm tờ 2 'Bán tại quầy' (bản nháp chờ duyệt)
- Tờ 1: bỏ long não, viết lại papain, thêm 'hỗ trợ' trước kháng khuẩn, bảng so sánh kem có kẽm oxyd,
  bảng dầu massage khớp phần giải thích, thêm tinh dầu mùi ở bước 1, cách dùng 1 tỉ lệ pha + thứ tự rửa-thấm khô-bôi kem,
  giá cả bộ trên bìa, thêm dấu hiệu khuyên đi khám
- Tờ 2 mới: câu hỏi khai thác, 1 câu nói mỗi SP, chốt bộ + đơn giá, 4 câu từ chối riêng hăm da, dặn mẹ (có nhãn CHỜ XÁC NHẬN)
- Bảng từ chối chung: số liệu 100 BV/1 triệu mẹ đưa vào [ ] chờ hồ sơ; sửa phép tính ~4.000đ/ngày;
  thay 'mua X tặng Y' (sell-in) bằng ưu đãi cho khách lẻ
- Chưa dựng lại PDF chính thức

Co-Authored-By: Claude Opus 5.5 <noreply@anthropic.com>
Claude-Session: https://claude.ai/code/session_01VwP8HixqZvnPoPbt56UbjW
</commit_message>
<xml_diff>
--- a/7. Hỗ trợ điểm bán/Sellout kit/Bảng khối vấn đề từ chối mua hàng (1 trang A4).docx
+++ b/7. Hỗ trợ điểm bán/Sellout kit/Bảng khối vấn đề từ chối mua hàng (1 trang A4).docx
@@ -445,7 +445,7 @@
                 <w:caps w:val="0"/>
                 <w:sz w:val="14"/>
               </w:rPr>
-              <w:t>“Mình lo về uy tín nói chung hay chưa thấy bán ở kênh quen ạ? DKX là thành viên DK Pharma, xuất phát từ ĐH Dược Hà Nội, sản xuất tại nhà máy đạt chuẩn [theo hồ sơ]; có mặt ở hơn 100 BV Sản Nhi, chuỗi Bibomart, Con Cưng, Kid Plaza…, hơn 1 triệu mẹ Việt tin dùng.”</w:t>
+              <w:t>“Mình lo về uy tín nói chung hay chưa thấy bán ở kênh quen ạ? DKX là thành viên DK Pharma, xuất phát từ ĐH Dược Hà Nội, sản xuất tại nhà máy đạt chuẩn [theo hồ sơ]; [số BV Sản Nhi, chuỗi phân phối, số khách đã dùng — chỉ nói khi có hồ sơ MKT].”</w:t>
             </w:r>
           </w:p>
           <w:p>
@@ -718,7 +718,7 @@
                 <w:caps w:val="0"/>
                 <w:sz w:val="14"/>
               </w:rPr>
-              <w:t>“Chia theo thời gian dùng thì nhẹ hơn nhiều: 1 chai tắm dùng ~1 tháng, chỉ khoảng 5.000đ/ngày, dịu nhẹ nên yên tâm dùng lâu dài; kèm chương trình [mua X tặng Y đang áp dụng].”</w:t>
+              <w:t>“Chia theo thời gian dùng thì nhẹ hơn nhiều: chai 200ml pha 5ml/lần tắm dùng ~40 lần, chưa tới 4.000đ/ngày, dịu nhẹ nên yên tâm dùng lâu dài; kèm [ưu đãi cho khách lẻ nếu shop có].”</w:t>
             </w:r>
           </w:p>
           <w:p>

</xml_diff>